<commit_message>
P3: shocker it was not final touches
</commit_message>
<xml_diff>
--- a/Project 3/Reports/P3 Final Report.docx
+++ b/Project 3/Reports/P3 Final Report.docx
@@ -241,27 +241,20 @@
     <w:p>
       <w:r>
         <w:lastRenderedPageBreak/>
-        <w:t xml:space="preserve">The proportional hazards assumption was assessed for each covariate using Schoenfeld residuals and formal tests. Diabetes status showed evidence of a potential violation of the proportional </w:t>
-      </w:r>
-      <w:proofErr w:type="gramStart"/>
-      <w:r>
-        <w:t>hazards</w:t>
-      </w:r>
-      <w:proofErr w:type="gramEnd"/>
-      <w:r>
-        <w:t xml:space="preserve"> assumption, suggesting its effect on stroke risk may not be constant over the 10-year follow-up period. This variable was retained in the model given its clinical </w:t>
-      </w:r>
-      <w:proofErr w:type="gramStart"/>
-      <w:r>
-        <w:t>importanc</w:t>
+        <w:t>The proportional hazards assumption was assessed for each covariate using Schoenfeld residuals and formal tests. Diabetes status showed evidence of a potential violation of the proportional hazards assumption, suggesting its effect on stroke risk may not be constant over the 10-year follow-up period. This variable was retained in the model given its clinical importanc</w:t>
       </w:r>
       <w:r>
         <w:t>e,</w:t>
       </w:r>
-      <w:proofErr w:type="gramEnd"/>
       <w:r>
         <w:t xml:space="preserve"> however, this finding is noted as a limitation and results involving diabetes should be interpreted with caution.</w:t>
       </w:r>
+      <w:r>
+        <w:t xml:space="preserve"> Schoenfeld residuals </w:t>
+      </w:r>
+      <w:r>
+        <w:t>shown in Appendix.</w:t>
+      </w:r>
     </w:p>
     <w:p>
       <w:r>
@@ -305,6 +298,9 @@
     </w:p>
     <w:p>
       <w:r>
+        <w:rPr>
+          <w:noProof/>
+        </w:rPr>
         <w:drawing>
           <wp:inline distT="0" distB="0" distL="0" distR="0" wp14:anchorId="512BAE1B" wp14:editId="0AAA2154">
             <wp:extent cx="5943600" cy="2502535"/>
@@ -381,6 +377,9 @@
     </w:p>
     <w:p>
       <w:r>
+        <w:rPr>
+          <w:noProof/>
+        </w:rPr>
         <w:drawing>
           <wp:inline distT="0" distB="0" distL="0" distR="0" wp14:anchorId="5337FE73" wp14:editId="4B10946B">
             <wp:extent cx="5943600" cy="3310255"/>
@@ -443,15 +442,7 @@
     </w:p>
     <w:p>
       <w:r>
-        <w:t xml:space="preserve">In the sex-stratified Cox proportional hazards models, systolic blood pressure and age were significantly associated with time to stroke in both males and females. Each one mmHg increase in systolic blood pressure was associated with a 3% increase in the hazard of stroke in both males (HR 1.03, 95% CI 1.02–1.04, p&lt;0.001) and females (HR 1.03, 95% CI 1.02–1.04, p&lt;0.001). Each </w:t>
-      </w:r>
-      <w:proofErr w:type="gramStart"/>
-      <w:r>
-        <w:t>one year</w:t>
-      </w:r>
-      <w:proofErr w:type="gramEnd"/>
-      <w:r>
-        <w:t xml:space="preserve"> increase in age was associated with a 7% increase in the hazard of stroke in both males (HR 1.07, 95% CI 1.03–1.11, p&lt;0.001) and females (HR 1.07, 95% CI 1.03–1.12, p&lt;0.001).</w:t>
+        <w:t>In the sex-stratified Cox proportional hazards models, systolic blood pressure and age were significantly associated with time to stroke in both males and females. Each one mmHg increase in systolic blood pressure was associated with a 3% increase in the hazard of stroke in both males (HR 1.03, 95% CI 1.02–1.04, p&lt;0.001) and females (HR 1.03, 95% CI 1.02–1.04, p&lt;0.001). Each one year increase in age was associated with a 7% increase in the hazard of stroke in both males (HR 1.07, 95% CI 1.03–1.11, p&lt;0.001) and females (HR 1.07, 95% CI 1.03–1.12, p&lt;0.001).</w:t>
       </w:r>
     </w:p>
     <w:p>
@@ -610,6 +601,9 @@
         </w:rPr>
       </w:pPr>
       <w:r>
+        <w:rPr>
+          <w:noProof/>
+        </w:rPr>
         <w:drawing>
           <wp:inline distT="0" distB="0" distL="0" distR="0" wp14:anchorId="097BF93F" wp14:editId="6E30C2A8">
             <wp:extent cx="4495800" cy="2252703"/>
@@ -656,6 +650,9 @@
         </w:rPr>
       </w:pPr>
       <w:r>
+        <w:rPr>
+          <w:noProof/>
+        </w:rPr>
         <w:drawing>
           <wp:inline distT="0" distB="0" distL="0" distR="0" wp14:anchorId="64621CD0" wp14:editId="60F3A001">
             <wp:extent cx="3945587" cy="2682240"/>
@@ -702,6 +699,9 @@
         </w:rPr>
       </w:pPr>
       <w:r>
+        <w:rPr>
+          <w:noProof/>
+        </w:rPr>
         <w:drawing>
           <wp:inline distT="0" distB="0" distL="0" distR="0" wp14:anchorId="5DB091FF" wp14:editId="2896B7E2">
             <wp:extent cx="3844707" cy="2613660"/>
@@ -748,6 +748,9 @@
         </w:rPr>
       </w:pPr>
       <w:r>
+        <w:rPr>
+          <w:noProof/>
+        </w:rPr>
         <w:lastRenderedPageBreak/>
         <w:drawing>
           <wp:inline distT="0" distB="0" distL="0" distR="0" wp14:anchorId="3F420E2F" wp14:editId="47514D07">
@@ -795,6 +798,9 @@
         </w:rPr>
       </w:pPr>
       <w:r>
+        <w:rPr>
+          <w:noProof/>
+        </w:rPr>
         <w:drawing>
           <wp:inline distT="0" distB="0" distL="0" distR="0" wp14:anchorId="4A09801A" wp14:editId="09C1A807">
             <wp:extent cx="3878532" cy="2545080"/>
@@ -841,6 +847,9 @@
         </w:rPr>
       </w:pPr>
       <w:r>
+        <w:rPr>
+          <w:noProof/>
+        </w:rPr>
         <w:drawing>
           <wp:inline distT="0" distB="0" distL="0" distR="0" wp14:anchorId="345623D5" wp14:editId="5EBA8E7E">
             <wp:extent cx="3796842" cy="2621280"/>
@@ -879,14 +888,109 @@
       </w:r>
     </w:p>
     <w:p>
+      <w:r>
+        <w:lastRenderedPageBreak/>
+        <w:t>Schoenfeld residuals – male</w:t>
+      </w:r>
+    </w:p>
+    <w:p>
       <w:pPr>
         <w:jc w:val="center"/>
-        <w:rPr>
-          <w:b/>
-          <w:bCs/>
-        </w:rPr>
-      </w:pPr>
-      <w:r>
+      </w:pPr>
+      <w:r>
+        <w:drawing>
+          <wp:inline distT="0" distB="0" distL="0" distR="0" wp14:anchorId="1D0EFD85" wp14:editId="3BB97853">
+            <wp:extent cx="5943600" cy="3168650"/>
+            <wp:effectExtent l="0" t="0" r="0" b="0"/>
+            <wp:docPr id="562040881" name="Picture 1"/>
+            <wp:cNvGraphicFramePr>
+              <a:graphicFrameLocks xmlns:a="http://schemas.openxmlformats.org/drawingml/2006/main" noChangeAspect="1"/>
+            </wp:cNvGraphicFramePr>
+            <a:graphic xmlns:a="http://schemas.openxmlformats.org/drawingml/2006/main">
+              <a:graphicData uri="http://schemas.openxmlformats.org/drawingml/2006/picture">
+                <pic:pic xmlns:pic="http://schemas.openxmlformats.org/drawingml/2006/picture">
+                  <pic:nvPicPr>
+                    <pic:cNvPr id="562040881" name=""/>
+                    <pic:cNvPicPr/>
+                  </pic:nvPicPr>
+                  <pic:blipFill>
+                    <a:blip r:embed="rId16"/>
+                    <a:stretch>
+                      <a:fillRect/>
+                    </a:stretch>
+                  </pic:blipFill>
+                  <pic:spPr>
+                    <a:xfrm>
+                      <a:off x="0" y="0"/>
+                      <a:ext cx="5943600" cy="3168650"/>
+                    </a:xfrm>
+                    <a:prstGeom prst="rect">
+                      <a:avLst/>
+                    </a:prstGeom>
+                  </pic:spPr>
+                </pic:pic>
+              </a:graphicData>
+            </a:graphic>
+          </wp:inline>
+        </w:drawing>
+      </w:r>
+    </w:p>
+    <w:p>
+      <w:r>
+        <w:t>Female</w:t>
+      </w:r>
+    </w:p>
+    <w:p>
+      <w:r>
+        <w:drawing>
+          <wp:inline distT="0" distB="0" distL="0" distR="0" wp14:anchorId="68E26B6A" wp14:editId="17C7E5A4">
+            <wp:extent cx="5943600" cy="3190875"/>
+            <wp:effectExtent l="0" t="0" r="0" b="9525"/>
+            <wp:docPr id="1700077107" name="Picture 1"/>
+            <wp:cNvGraphicFramePr>
+              <a:graphicFrameLocks xmlns:a="http://schemas.openxmlformats.org/drawingml/2006/main" noChangeAspect="1"/>
+            </wp:cNvGraphicFramePr>
+            <a:graphic xmlns:a="http://schemas.openxmlformats.org/drawingml/2006/main">
+              <a:graphicData uri="http://schemas.openxmlformats.org/drawingml/2006/picture">
+                <pic:pic xmlns:pic="http://schemas.openxmlformats.org/drawingml/2006/picture">
+                  <pic:nvPicPr>
+                    <pic:cNvPr id="1700077107" name=""/>
+                    <pic:cNvPicPr/>
+                  </pic:nvPicPr>
+                  <pic:blipFill>
+                    <a:blip r:embed="rId17"/>
+                    <a:stretch>
+                      <a:fillRect/>
+                    </a:stretch>
+                  </pic:blipFill>
+                  <pic:spPr>
+                    <a:xfrm>
+                      <a:off x="0" y="0"/>
+                      <a:ext cx="5943600" cy="3190875"/>
+                    </a:xfrm>
+                    <a:prstGeom prst="rect">
+                      <a:avLst/>
+                    </a:prstGeom>
+                  </pic:spPr>
+                </pic:pic>
+              </a:graphicData>
+            </a:graphic>
+          </wp:inline>
+        </w:drawing>
+      </w:r>
+    </w:p>
+    <w:p>
+      <w:pPr>
+        <w:jc w:val="center"/>
+        <w:rPr>
+          <w:b/>
+          <w:bCs/>
+        </w:rPr>
+      </w:pPr>
+      <w:r>
+        <w:rPr>
+          <w:noProof/>
+        </w:rPr>
         <w:lastRenderedPageBreak/>
         <w:drawing>
           <wp:inline distT="0" distB="0" distL="0" distR="0" wp14:anchorId="52D442C9" wp14:editId="54297D9A">
@@ -904,7 +1008,7 @@
                     <pic:cNvPicPr/>
                   </pic:nvPicPr>
                   <pic:blipFill>
-                    <a:blip r:embed="rId16"/>
+                    <a:blip r:embed="rId18"/>
                     <a:stretch>
                       <a:fillRect/>
                     </a:stretch>
@@ -926,7 +1030,7 @@
       </w:r>
     </w:p>
     <w:sectPr>
-      <w:footerReference w:type="default" r:id="rId17"/>
+      <w:footerReference w:type="default" r:id="rId19"/>
       <w:pgSz w:w="12240" w:h="15840"/>
       <w:pgMar w:top="1440" w:right="1440" w:bottom="1440" w:left="1440" w:header="720" w:footer="720" w:gutter="0"/>
       <w:cols w:space="720"/>
@@ -1642,6 +1746,7 @@
   <w:style w:type="character" w:default="1" w:styleId="DefaultParagraphFont">
     <w:name w:val="Default Paragraph Font"/>
     <w:uiPriority w:val="1"/>
+    <w:semiHidden/>
     <w:unhideWhenUsed/>
   </w:style>
   <w:style w:type="table" w:default="1" w:styleId="TableNormal">

</xml_diff>